<commit_message>
completed week 6 activities
</commit_message>
<xml_diff>
--- a/Week5/Stage_2_SmartCare_v02_Requirements_Template.docx
+++ b/Week5/Stage_2_SmartCare_v02_Requirements_Template.docx
@@ -88,12 +88,32 @@
             <w:tcW w:w="3408" w:type="dxa"/>
           </w:tcPr>
           <w:p>
+            <w:pPr>
+              <w:rPr>
+                <w:highlight w:val="yellow"/>
+              </w:rPr>
+            </w:pPr>
             <w:r>
+              <w:rPr>
+                <w:highlight w:val="yellow"/>
+              </w:rPr>
               <w:t>Receptionist</w:t>
             </w:r>
           </w:p>
-          <w:p/>
-          <w:p/>
+          <w:p>
+            <w:pPr>
+              <w:rPr>
+                <w:highlight w:val="yellow"/>
+              </w:rPr>
+            </w:pPr>
+          </w:p>
+          <w:p>
+            <w:pPr>
+              <w:rPr>
+                <w:highlight w:val="yellow"/>
+              </w:rPr>
+            </w:pPr>
+          </w:p>
         </w:tc>
         <w:tc>
           <w:tcPr>
@@ -124,11 +144,25 @@
             <w:tcW w:w="3408" w:type="dxa"/>
           </w:tcPr>
           <w:p>
+            <w:pPr>
+              <w:rPr>
+                <w:highlight w:val="yellow"/>
+              </w:rPr>
+            </w:pPr>
             <w:r>
+              <w:rPr>
+                <w:highlight w:val="yellow"/>
+              </w:rPr>
               <w:t>Patient</w:t>
             </w:r>
           </w:p>
-          <w:p/>
+          <w:p>
+            <w:pPr>
+              <w:rPr>
+                <w:highlight w:val="yellow"/>
+              </w:rPr>
+            </w:pPr>
+          </w:p>
         </w:tc>
         <w:tc>
           <w:tcPr>
@@ -157,11 +191,25 @@
             <w:tcW w:w="3408" w:type="dxa"/>
           </w:tcPr>
           <w:p>
+            <w:pPr>
+              <w:rPr>
+                <w:highlight w:val="yellow"/>
+              </w:rPr>
+            </w:pPr>
             <w:r>
+              <w:rPr>
+                <w:highlight w:val="yellow"/>
+              </w:rPr>
               <w:t>General practitioner</w:t>
             </w:r>
           </w:p>
-          <w:p/>
+          <w:p>
+            <w:pPr>
+              <w:rPr>
+                <w:highlight w:val="yellow"/>
+              </w:rPr>
+            </w:pPr>
+          </w:p>
         </w:tc>
         <w:tc>
           <w:tcPr>
@@ -190,11 +238,25 @@
             <w:tcW w:w="3408" w:type="dxa"/>
           </w:tcPr>
           <w:p>
+            <w:pPr>
+              <w:rPr>
+                <w:highlight w:val="yellow"/>
+              </w:rPr>
+            </w:pPr>
             <w:r>
+              <w:rPr>
+                <w:highlight w:val="yellow"/>
+              </w:rPr>
               <w:t>Manager/Head/Senior Clinician</w:t>
             </w:r>
           </w:p>
-          <w:p/>
+          <w:p>
+            <w:pPr>
+              <w:rPr>
+                <w:highlight w:val="yellow"/>
+              </w:rPr>
+            </w:pPr>
+          </w:p>
         </w:tc>
         <w:tc>
           <w:tcPr>
@@ -237,35 +299,96 @@
     <w:p/>
     <w:p>
       <w:r>
-        <w:t xml:space="preserve">FR-01: Searching for patient records using name or unique identifier. </w:t>
+        <w:t xml:space="preserve">FR-01: </w:t>
+      </w:r>
+      <w:r>
+        <w:rPr>
+          <w:highlight w:val="green"/>
+        </w:rPr>
+        <w:t>Searching</w:t>
+      </w:r>
+      <w:r>
+        <w:t xml:space="preserve"> for patient records using name or unique identifier. </w:t>
       </w:r>
     </w:p>
     <w:p>
       <w:r>
-        <w:t>FR-02: Preventing double bookings</w:t>
+        <w:t xml:space="preserve">FR-02: </w:t>
+      </w:r>
+      <w:r>
+        <w:rPr>
+          <w:highlight w:val="cyan"/>
+        </w:rPr>
+        <w:t>Preventing double bookings</w:t>
+      </w:r>
+    </w:p>
+    <w:p>
+      <w:pPr>
+        <w:rPr>
+          <w:highlight w:val="cyan"/>
+        </w:rPr>
+      </w:pPr>
+      <w:r>
+        <w:t xml:space="preserve">FR-03: </w:t>
+      </w:r>
+      <w:r>
+        <w:rPr>
+          <w:highlight w:val="green"/>
+        </w:rPr>
+        <w:t>Validating</w:t>
+      </w:r>
+      <w:r>
+        <w:t xml:space="preserve"> </w:t>
+      </w:r>
+      <w:r>
+        <w:rPr>
+          <w:highlight w:val="cyan"/>
+        </w:rPr>
+        <w:t xml:space="preserve">patients name, email </w:t>
+      </w:r>
+      <w:proofErr w:type="spellStart"/>
+      <w:r>
+        <w:rPr>
+          <w:highlight w:val="cyan"/>
+        </w:rPr>
+        <w:t>e.t.c</w:t>
+      </w:r>
+      <w:proofErr w:type="spellEnd"/>
+      <w:r>
+        <w:rPr>
+          <w:highlight w:val="cyan"/>
+        </w:rPr>
+        <w:t>.</w:t>
+      </w:r>
+    </w:p>
+    <w:p>
+      <w:pPr>
+        <w:rPr>
+          <w:highlight w:val="cyan"/>
+        </w:rPr>
+      </w:pPr>
+      <w:r>
+        <w:t xml:space="preserve">FR-04: </w:t>
+      </w:r>
+      <w:r>
+        <w:rPr>
+          <w:highlight w:val="cyan"/>
+        </w:rPr>
+        <w:t>Validating patients phone number</w:t>
       </w:r>
     </w:p>
     <w:p>
       <w:r>
-        <w:t xml:space="preserve">FR-03: Validating patients name, email </w:t>
+        <w:t xml:space="preserve">FR-05: </w:t>
       </w:r>
-      <w:proofErr w:type="spellStart"/>
       <w:r>
-        <w:t>e.t.c</w:t>
+        <w:rPr>
+          <w:highlight w:val="cyan"/>
+        </w:rPr>
+        <w:t>Validating Date of Birth and Appointment date times.</w:t>
       </w:r>
-      <w:proofErr w:type="spellEnd"/>
       <w:r>
-        <w:t>.</w:t>
-      </w:r>
-    </w:p>
-    <w:p>
-      <w:r>
-        <w:t>FR-04: Validating patients phone number</w:t>
-      </w:r>
-    </w:p>
-    <w:p>
-      <w:r>
-        <w:t xml:space="preserve">FR-05: Validating Date of Birth and Appointment date times. </w:t>
+        <w:t xml:space="preserve"> </w:t>
       </w:r>
     </w:p>
     <w:p>
@@ -275,12 +398,39 @@
     </w:p>
     <w:p>
       <w:r>
-        <w:t xml:space="preserve">FR-07:  Appointment cancellations </w:t>
+        <w:t xml:space="preserve">FR-07:  </w:t>
+      </w:r>
+      <w:r>
+        <w:rPr>
+          <w:highlight w:val="cyan"/>
+        </w:rPr>
+        <w:t xml:space="preserve">Appointment </w:t>
+      </w:r>
+      <w:r>
+        <w:rPr>
+          <w:highlight w:val="green"/>
+        </w:rPr>
+        <w:t>cancellations</w:t>
+      </w:r>
+      <w:r>
+        <w:t xml:space="preserve"> </w:t>
       </w:r>
     </w:p>
     <w:p>
       <w:r>
-        <w:t xml:space="preserve">FR-08: Viewing appointment history. </w:t>
+        <w:t xml:space="preserve">FR-08: </w:t>
+      </w:r>
+      <w:r>
+        <w:rPr>
+          <w:highlight w:val="green"/>
+        </w:rPr>
+        <w:t>Viewing</w:t>
+      </w:r>
+      <w:r>
+        <w:t xml:space="preserve"> appointment history.</w:t>
+      </w:r>
+      <w:r>
+        <w:t xml:space="preserve"> </w:t>
       </w:r>
     </w:p>
     <w:p>
@@ -291,7 +441,16 @@
     <w:p>
       <w:r>
         <w:lastRenderedPageBreak/>
-        <w:t>FR-10: Report generation to generate patient reports</w:t>
+        <w:t xml:space="preserve">FR-10: </w:t>
+      </w:r>
+      <w:r>
+        <w:rPr>
+          <w:highlight w:val="green"/>
+        </w:rPr>
+        <w:t>Report generation</w:t>
+      </w:r>
+      <w:r>
+        <w:t xml:space="preserve"> to generate patient reports</w:t>
       </w:r>
     </w:p>
     <w:p>
@@ -301,7 +460,16 @@
     </w:p>
     <w:p>
       <w:r>
-        <w:t>FR-12: Updating patient records</w:t>
+        <w:t xml:space="preserve">FR-12: </w:t>
+      </w:r>
+      <w:r>
+        <w:rPr>
+          <w:highlight w:val="green"/>
+        </w:rPr>
+        <w:t>Updating</w:t>
+      </w:r>
+      <w:r>
+        <w:t xml:space="preserve"> patient records</w:t>
       </w:r>
     </w:p>
     <w:p/>
@@ -331,17 +499,38 @@
     </w:p>
     <w:p>
       <w:r>
-        <w:t xml:space="preserve">NFR-02: Encrypting patient details </w:t>
+        <w:t xml:space="preserve">NFR-02: </w:t>
+      </w:r>
+      <w:r>
+        <w:rPr>
+          <w:highlight w:val="cyan"/>
+        </w:rPr>
+        <w:t>Encrypting patient details</w:t>
+      </w:r>
+      <w:r>
+        <w:t xml:space="preserve"> </w:t>
       </w:r>
     </w:p>
     <w:p>
       <w:r>
-        <w:t>NFR-03: Booking should be complete within 3 clicks</w:t>
+        <w:t xml:space="preserve">NFR-03: </w:t>
+      </w:r>
+      <w:r>
+        <w:rPr>
+          <w:highlight w:val="cyan"/>
+        </w:rPr>
+        <w:t>Booking should be complete within 3 clicks</w:t>
       </w:r>
     </w:p>
     <w:p>
       <w:r>
-        <w:t>NFR-04: The system should display error messages clearly</w:t>
+        <w:t xml:space="preserve">NFR-04: </w:t>
+      </w:r>
+      <w:r>
+        <w:rPr>
+          <w:highlight w:val="cyan"/>
+        </w:rPr>
+        <w:t>The system should display error messages clearly</w:t>
       </w:r>
     </w:p>
     <w:p>

</xml_diff>